<commit_message>
Added AI Image Citation
</commit_message>
<xml_diff>
--- a/Module-1/Breutzmann-Assignment 1.2.docx
+++ b/Module-1/Breutzmann-Assignment 1.2.docx
@@ -162,7 +162,29 @@
         </w:numPr>
       </w:pPr>
       <w:r>
-        <w:t xml:space="preserve">As a boat owner and slip holder, I would like the option to have marina staff check on my boat for me if I’m going to be gone for extended periods of time </w:t>
+        <w:t>As a boat owner and slip holder, I would like the option to have marina staff check on my boat for me if I’m going to be gone for extended periods of time</w:t>
+      </w:r>
+      <w:r>
+        <w:t>.</w:t>
+      </w:r>
+    </w:p>
+    <w:p>
+      <w:r>
+        <w:t xml:space="preserve">OpenAI. (2026). </w:t>
+      </w:r>
+      <w:r>
+        <w:rPr>
+          <w:rStyle w:val="Emphasis"/>
+        </w:rPr>
+        <w:t>Portrait of Walt at a marina</w:t>
+      </w:r>
+      <w:r>
+        <w:t xml:space="preserve"> [AI-generated image]. ChatGPT.</w:t>
+      </w:r>
+    </w:p>
+    <w:p>
+      <w:r>
+        <w:t xml:space="preserve"> </w:t>
       </w:r>
     </w:p>
     <w:sectPr>
@@ -170,7 +192,7 @@
       <w:headerReference w:type="default" r:id="rId9"/>
       <w:headerReference w:type="first" r:id="rId10"/>
       <w:pgSz w:w="12240" w:h="15840"/>
-      <w:pgMar w:top="1440" w:right="1440" w:bottom="1440" w:left="1440" w:header="720" w:footer="720" w:gutter="0"/>
+      <w:pgMar w:top="1440" w:right="1080" w:bottom="1440" w:left="1080" w:header="720" w:footer="720" w:gutter="0"/>
       <w:cols w:space="720"/>
       <w:titlePg/>
       <w:docGrid w:linePitch="360"/>
@@ -1499,6 +1521,17 @@
     <w:unhideWhenUsed/>
     <w:rsid w:val="005E1F3D"/>
   </w:style>
+  <w:style w:type="character" w:styleId="Emphasis">
+    <w:name w:val="Emphasis"/>
+    <w:basedOn w:val="DefaultParagraphFont"/>
+    <w:uiPriority w:val="20"/>
+    <w:qFormat/>
+    <w:rsid w:val="006A2749"/>
+    <w:rPr>
+      <w:i/>
+      <w:iCs/>
+    </w:rPr>
+  </w:style>
 </w:styles>
 </file>
 

</xml_diff>